<commit_message>
Phases 11-12: early warning with calibrated margins, rolling-origin robustness
</commit_message>
<xml_diff>
--- a/docs/Predictive_Memory_Paging_Project_Report.docx
+++ b/docs/Predictive_Memory_Paging_Project_Report.docx
@@ -27524,1291 +27524,6 @@
         <w:t xml:space="preserve">ML-Based Data Prefetching Competition LoadTraces, download list in github.com/Quangmire/ChampSim.</w:t>
       </w:r>
     </w:p>
-    <w:p>
-      <w:pPr>
-        <w:pStyle w:val="Heading1"/>
-        <w:pageBreakBefore/>
-        <w:spacing w:after="240"/>
-      </w:pPr>
-      <w:r>
-        <w:t xml:space="preserve">Appendix A: How to Run the Project</w:t>
-      </w:r>
-    </w:p>
-    <w:p>
-      <w:pPr>
-        <w:pStyle w:val="ListParagraph"/>
-        <w:numPr>
-          <w:ilvl w:val="0"/>
-          <w:numId w:val="6"/>
-        </w:numPr>
-        <w:spacing w:after="60" w:line="340"/>
-        <w:jc w:val="left"/>
-      </w:pPr>
-      <w:r>
-        <w:t xml:space="preserve">Install Python 3.9 or later and Git.</w:t>
-      </w:r>
-    </w:p>
-    <w:p>
-      <w:pPr>
-        <w:pStyle w:val="ListParagraph"/>
-        <w:numPr>
-          <w:ilvl w:val="0"/>
-          <w:numId w:val="6"/>
-        </w:numPr>
-        <w:spacing w:after="60" w:line="340"/>
-        <w:jc w:val="left"/>
-      </w:pPr>
-      <w:r>
-        <w:t xml:space="preserve">Get the code: git clone https://github.com/shrey1-1/Predictive-memory-paging-system-.git</w:t>
-      </w:r>
-    </w:p>
-    <w:p>
-      <w:pPr>
-        <w:pStyle w:val="ListParagraph"/>
-        <w:numPr>
-          <w:ilvl w:val="0"/>
-          <w:numId w:val="6"/>
-        </w:numPr>
-        <w:spacing w:after="60" w:line="340"/>
-        <w:jc w:val="left"/>
-      </w:pPr>
-      <w:r>
-        <w:t xml:space="preserve">Install the dependencies: python -m pip install -r requirements.txt -r requirements-dev.txt</w:t>
-      </w:r>
-    </w:p>
-    <w:p>
-      <w:pPr>
-        <w:pStyle w:val="ListParagraph"/>
-        <w:numPr>
-          <w:ilvl w:val="0"/>
-          <w:numId w:val="6"/>
-        </w:numPr>
-        <w:spacing w:after="60" w:line="340"/>
-        <w:jc w:val="left"/>
-      </w:pPr>
-      <w:r>
-        <w:t xml:space="preserve">Run the tests: python -m pytest -q (all tests should pass).</w:t>
-      </w:r>
-    </w:p>
-    <w:p>
-      <w:pPr>
-        <w:pStyle w:val="ListParagraph"/>
-        <w:numPr>
-          <w:ilvl w:val="0"/>
-          <w:numId w:val="6"/>
-        </w:numPr>
-        <w:spacing w:after="60" w:line="340"/>
-        <w:jc w:val="left"/>
-      </w:pPr>
-      <w:r>
-        <w:t xml:space="preserve">Download the real traces: git clone https://github.com/Quangmire/ChampSim.git, then python scripts/02_download_real_traces.py --links ChampSim/download_links --pick &lt;trace names&gt;</w:t>
-      </w:r>
-    </w:p>
-    <w:p>
-      <w:pPr>
-        <w:pStyle w:val="ListParagraph"/>
-        <w:numPr>
-          <w:ilvl w:val="0"/>
-          <w:numId w:val="6"/>
-        </w:numPr>
-        <w:spacing w:after="60" w:line="340"/>
-        <w:jc w:val="left"/>
-      </w:pPr>
-      <w:r>
-        <w:t xml:space="preserve">Run every experiment and build the report: python scripts/run_all.py (about 15–25 minutes), then open results/report.html.</w:t>
-      </w:r>
-    </w:p>
-    <w:p>
-      <w:pPr>
-        <w:pStyle w:val="ListParagraph"/>
-        <w:numPr>
-          <w:ilvl w:val="0"/>
-          <w:numId w:val="6"/>
-        </w:numPr>
-        <w:spacing w:after="60" w:line="340"/>
-        <w:jc w:val="left"/>
-      </w:pPr>
-      <w:r>
-        <w:t xml:space="preserve">On Windows, if “python” is not recognised, use “py” instead.</w:t>
-      </w:r>
-    </w:p>
-    <w:p>
-      <w:pPr>
-        <w:pStyle w:val="Heading1"/>
-        <w:pageBreakBefore/>
-        <w:spacing w:after="240"/>
-      </w:pPr>
-      <w:r>
-        <w:t xml:space="preserve">Appendix B: Glossary</w:t>
-      </w:r>
-    </w:p>
-    <w:p>
-      <w:pPr>
-        <w:keepNext/>
-        <w:spacing w:after="200" w:before="60"/>
-        <w:jc w:val="center"/>
-      </w:pPr>
-      <w:r>
-        <w:rPr>
-          <w:b/>
-          <w:bCs/>
-          <w:sz w:val="20"/>
-          <w:szCs w:val="20"/>
-        </w:rPr>
-        <w:t xml:space="preserve">Table 19: </w:t>
-      </w:r>
-      <w:r>
-        <w:rPr>
-          <w:sz w:val="20"/>
-          <w:szCs w:val="20"/>
-        </w:rPr>
-        <w:t xml:space="preserve">Glossary</w:t>
-      </w:r>
-    </w:p>
-    <w:tbl>
-      <w:tblPr>
-        <w:tblW w:type="dxa" w:w="9000"/>
-        <w:tblBorders>
-          <w:top w:val="single" w:color="auto" w:sz="4"/>
-          <w:left w:val="single" w:color="auto" w:sz="4"/>
-          <w:bottom w:val="single" w:color="auto" w:sz="4"/>
-          <w:right w:val="single" w:color="auto" w:sz="4"/>
-          <w:insideH w:val="single" w:color="auto" w:sz="4"/>
-          <w:insideV w:val="single" w:color="auto" w:sz="4"/>
-        </w:tblBorders>
-      </w:tblPr>
-      <w:tblGrid>
-        <w:gridCol w:w="2340"/>
-        <w:gridCol w:w="6660"/>
-      </w:tblGrid>
-      <w:tr>
-        <w:trPr>
-          <w:cantSplit/>
-          <w:tblHeader/>
-        </w:trPr>
-        <w:tc>
-          <w:tcPr>
-            <w:tcW w:type="dxa" w:w="2340"/>
-            <w:tcBorders>
-              <w:top w:val="single" w:color="BFBAB0" w:sz="4"/>
-              <w:left w:val="single" w:color="BFBAB0" w:sz="4"/>
-              <w:bottom w:val="single" w:color="BFBAB0" w:sz="4"/>
-              <w:right w:val="single" w:color="BFBAB0" w:sz="4"/>
-            </w:tcBorders>
-            <w:shd w:fill="F2F0EC" w:color="auto" w:val="clear"/>
-            <w:tcMar>
-              <w:top w:type="dxa" w:w="50"/>
-              <w:left w:type="dxa" w:w="90"/>
-              <w:bottom w:type="dxa" w:w="50"/>
-              <w:right w:type="dxa" w:w="90"/>
-            </w:tcMar>
-          </w:tcPr>
-          <w:p>
-            <w:pPr>
-              <w:spacing w:after="0" w:line="260"/>
-              <w:jc w:val="left"/>
-            </w:pPr>
-            <w:r>
-              <w:rPr>
-                <w:b/>
-                <w:bCs/>
-                <w:sz w:val="19"/>
-                <w:szCs w:val="19"/>
-              </w:rPr>
-              <w:t xml:space="preserve">Term</w:t>
-            </w:r>
-          </w:p>
-        </w:tc>
-        <w:tc>
-          <w:tcPr>
-            <w:tcW w:type="dxa" w:w="6660"/>
-            <w:tcBorders>
-              <w:top w:val="single" w:color="BFBAB0" w:sz="4"/>
-              <w:left w:val="single" w:color="BFBAB0" w:sz="4"/>
-              <w:bottom w:val="single" w:color="BFBAB0" w:sz="4"/>
-              <w:right w:val="single" w:color="BFBAB0" w:sz="4"/>
-            </w:tcBorders>
-            <w:shd w:fill="F2F0EC" w:color="auto" w:val="clear"/>
-            <w:tcMar>
-              <w:top w:type="dxa" w:w="50"/>
-              <w:left w:type="dxa" w:w="90"/>
-              <w:bottom w:type="dxa" w:w="50"/>
-              <w:right w:type="dxa" w:w="90"/>
-            </w:tcMar>
-          </w:tcPr>
-          <w:p>
-            <w:pPr>
-              <w:spacing w:after="0" w:line="260"/>
-              <w:jc w:val="left"/>
-            </w:pPr>
-            <w:r>
-              <w:rPr>
-                <w:b/>
-                <w:bCs/>
-                <w:sz w:val="19"/>
-                <w:szCs w:val="19"/>
-              </w:rPr>
-              <w:t xml:space="preserve">Meaning</w:t>
-            </w:r>
-          </w:p>
-        </w:tc>
-      </w:tr>
-      <w:tr>
-        <w:trPr>
-          <w:cantSplit/>
-          <w:tblHeader w:val="off"/>
-        </w:trPr>
-        <w:tc>
-          <w:tcPr>
-            <w:tcW w:type="dxa" w:w="2340"/>
-            <w:tcBorders>
-              <w:top w:val="single" w:color="BFBAB0" w:sz="4"/>
-              <w:left w:val="single" w:color="BFBAB0" w:sz="4"/>
-              <w:bottom w:val="single" w:color="BFBAB0" w:sz="4"/>
-              <w:right w:val="single" w:color="BFBAB0" w:sz="4"/>
-            </w:tcBorders>
-            <w:tcMar>
-              <w:top w:type="dxa" w:w="50"/>
-              <w:left w:type="dxa" w:w="90"/>
-              <w:bottom w:type="dxa" w:w="50"/>
-              <w:right w:type="dxa" w:w="90"/>
-            </w:tcMar>
-          </w:tcPr>
-          <w:p>
-            <w:pPr>
-              <w:spacing w:after="0" w:line="260"/>
-              <w:jc w:val="left"/>
-            </w:pPr>
-            <w:r>
-              <w:rPr>
-                <w:b w:val="false"/>
-                <w:bCs w:val="false"/>
-                <w:sz w:val="19"/>
-                <w:szCs w:val="19"/>
-              </w:rPr>
-              <w:t xml:space="preserve">Page / frame</w:t>
-            </w:r>
-          </w:p>
-        </w:tc>
-        <w:tc>
-          <w:tcPr>
-            <w:tcW w:type="dxa" w:w="6660"/>
-            <w:tcBorders>
-              <w:top w:val="single" w:color="BFBAB0" w:sz="4"/>
-              <w:left w:val="single" w:color="BFBAB0" w:sz="4"/>
-              <w:bottom w:val="single" w:color="BFBAB0" w:sz="4"/>
-              <w:right w:val="single" w:color="BFBAB0" w:sz="4"/>
-            </w:tcBorders>
-            <w:tcMar>
-              <w:top w:type="dxa" w:w="50"/>
-              <w:left w:type="dxa" w:w="90"/>
-              <w:bottom w:type="dxa" w:w="50"/>
-              <w:right w:type="dxa" w:w="90"/>
-            </w:tcMar>
-          </w:tcPr>
-          <w:p>
-            <w:pPr>
-              <w:spacing w:after="0" w:line="260"/>
-              <w:jc w:val="left"/>
-            </w:pPr>
-            <w:r>
-              <w:rPr>
-                <w:b w:val="false"/>
-                <w:bCs w:val="false"/>
-                <w:sz w:val="19"/>
-                <w:szCs w:val="19"/>
-              </w:rPr>
-              <w:t xml:space="preserve">a 4 KB block of memory / a slot in RAM that holds one page</w:t>
-            </w:r>
-          </w:p>
-        </w:tc>
-      </w:tr>
-      <w:tr>
-        <w:trPr>
-          <w:cantSplit/>
-          <w:tblHeader w:val="off"/>
-        </w:trPr>
-        <w:tc>
-          <w:tcPr>
-            <w:tcW w:type="dxa" w:w="2340"/>
-            <w:tcBorders>
-              <w:top w:val="single" w:color="BFBAB0" w:sz="4"/>
-              <w:left w:val="single" w:color="BFBAB0" w:sz="4"/>
-              <w:bottom w:val="single" w:color="BFBAB0" w:sz="4"/>
-              <w:right w:val="single" w:color="BFBAB0" w:sz="4"/>
-            </w:tcBorders>
-            <w:tcMar>
-              <w:top w:type="dxa" w:w="50"/>
-              <w:left w:type="dxa" w:w="90"/>
-              <w:bottom w:type="dxa" w:w="50"/>
-              <w:right w:type="dxa" w:w="90"/>
-            </w:tcMar>
-          </w:tcPr>
-          <w:p>
-            <w:pPr>
-              <w:spacing w:after="0" w:line="260"/>
-              <w:jc w:val="left"/>
-            </w:pPr>
-            <w:r>
-              <w:rPr>
-                <w:b w:val="false"/>
-                <w:bCs w:val="false"/>
-                <w:sz w:val="19"/>
-                <w:szCs w:val="19"/>
-              </w:rPr>
-              <w:t xml:space="preserve">Page fault</w:t>
-            </w:r>
-          </w:p>
-        </w:tc>
-        <w:tc>
-          <w:tcPr>
-            <w:tcW w:type="dxa" w:w="6660"/>
-            <w:tcBorders>
-              <w:top w:val="single" w:color="BFBAB0" w:sz="4"/>
-              <w:left w:val="single" w:color="BFBAB0" w:sz="4"/>
-              <w:bottom w:val="single" w:color="BFBAB0" w:sz="4"/>
-              <w:right w:val="single" w:color="BFBAB0" w:sz="4"/>
-            </w:tcBorders>
-            <w:tcMar>
-              <w:top w:type="dxa" w:w="50"/>
-              <w:left w:type="dxa" w:w="90"/>
-              <w:bottom w:type="dxa" w:w="50"/>
-              <w:right w:type="dxa" w:w="90"/>
-            </w:tcMar>
-          </w:tcPr>
-          <w:p>
-            <w:pPr>
-              <w:spacing w:after="0" w:line="260"/>
-              <w:jc w:val="left"/>
-            </w:pPr>
-            <w:r>
-              <w:rPr>
-                <w:b w:val="false"/>
-                <w:bCs w:val="false"/>
-                <w:sz w:val="19"/>
-                <w:szCs w:val="19"/>
-              </w:rPr>
-              <w:t xml:space="preserve">a request for a page that is not in RAM</w:t>
-            </w:r>
-          </w:p>
-        </w:tc>
-      </w:tr>
-      <w:tr>
-        <w:trPr>
-          <w:cantSplit/>
-          <w:tblHeader w:val="off"/>
-        </w:trPr>
-        <w:tc>
-          <w:tcPr>
-            <w:tcW w:type="dxa" w:w="2340"/>
-            <w:tcBorders>
-              <w:top w:val="single" w:color="BFBAB0" w:sz="4"/>
-              <w:left w:val="single" w:color="BFBAB0" w:sz="4"/>
-              <w:bottom w:val="single" w:color="BFBAB0" w:sz="4"/>
-              <w:right w:val="single" w:color="BFBAB0" w:sz="4"/>
-            </w:tcBorders>
-            <w:tcMar>
-              <w:top w:type="dxa" w:w="50"/>
-              <w:left w:type="dxa" w:w="90"/>
-              <w:bottom w:type="dxa" w:w="50"/>
-              <w:right w:type="dxa" w:w="90"/>
-            </w:tcMar>
-          </w:tcPr>
-          <w:p>
-            <w:pPr>
-              <w:spacing w:after="0" w:line="260"/>
-              <w:jc w:val="left"/>
-            </w:pPr>
-            <w:r>
-              <w:rPr>
-                <w:b w:val="false"/>
-                <w:bCs w:val="false"/>
-                <w:sz w:val="19"/>
-                <w:szCs w:val="19"/>
-              </w:rPr>
-              <w:t xml:space="preserve">Compulsory fault</w:t>
-            </w:r>
-          </w:p>
-        </w:tc>
-        <w:tc>
-          <w:tcPr>
-            <w:tcW w:type="dxa" w:w="6660"/>
-            <w:tcBorders>
-              <w:top w:val="single" w:color="BFBAB0" w:sz="4"/>
-              <w:left w:val="single" w:color="BFBAB0" w:sz="4"/>
-              <w:bottom w:val="single" w:color="BFBAB0" w:sz="4"/>
-              <w:right w:val="single" w:color="BFBAB0" w:sz="4"/>
-            </w:tcBorders>
-            <w:tcMar>
-              <w:top w:type="dxa" w:w="50"/>
-              <w:left w:type="dxa" w:w="90"/>
-              <w:bottom w:type="dxa" w:w="50"/>
-              <w:right w:type="dxa" w:w="90"/>
-            </w:tcMar>
-          </w:tcPr>
-          <w:p>
-            <w:pPr>
-              <w:spacing w:after="0" w:line="260"/>
-              <w:jc w:val="left"/>
-            </w:pPr>
-            <w:r>
-              <w:rPr>
-                <w:b w:val="false"/>
-                <w:bCs w:val="false"/>
-                <w:sz w:val="19"/>
-                <w:szCs w:val="19"/>
-              </w:rPr>
-              <w:t xml:space="preserve">the fault on the first request for a page</w:t>
-            </w:r>
-          </w:p>
-        </w:tc>
-      </w:tr>
-      <w:tr>
-        <w:trPr>
-          <w:cantSplit/>
-          <w:tblHeader w:val="off"/>
-        </w:trPr>
-        <w:tc>
-          <w:tcPr>
-            <w:tcW w:type="dxa" w:w="2340"/>
-            <w:tcBorders>
-              <w:top w:val="single" w:color="BFBAB0" w:sz="4"/>
-              <w:left w:val="single" w:color="BFBAB0" w:sz="4"/>
-              <w:bottom w:val="single" w:color="BFBAB0" w:sz="4"/>
-              <w:right w:val="single" w:color="BFBAB0" w:sz="4"/>
-            </w:tcBorders>
-            <w:tcMar>
-              <w:top w:type="dxa" w:w="50"/>
-              <w:left w:type="dxa" w:w="90"/>
-              <w:bottom w:type="dxa" w:w="50"/>
-              <w:right w:type="dxa" w:w="90"/>
-            </w:tcMar>
-          </w:tcPr>
-          <w:p>
-            <w:pPr>
-              <w:spacing w:after="0" w:line="260"/>
-              <w:jc w:val="left"/>
-            </w:pPr>
-            <w:r>
-              <w:rPr>
-                <w:b w:val="false"/>
-                <w:bCs w:val="false"/>
-                <w:sz w:val="19"/>
-                <w:szCs w:val="19"/>
-              </w:rPr>
-              <w:t xml:space="preserve">Working set</w:t>
-            </w:r>
-          </w:p>
-        </w:tc>
-        <w:tc>
-          <w:tcPr>
-            <w:tcW w:type="dxa" w:w="6660"/>
-            <w:tcBorders>
-              <w:top w:val="single" w:color="BFBAB0" w:sz="4"/>
-              <w:left w:val="single" w:color="BFBAB0" w:sz="4"/>
-              <w:bottom w:val="single" w:color="BFBAB0" w:sz="4"/>
-              <w:right w:val="single" w:color="BFBAB0" w:sz="4"/>
-            </w:tcBorders>
-            <w:tcMar>
-              <w:top w:type="dxa" w:w="50"/>
-              <w:left w:type="dxa" w:w="90"/>
-              <w:bottom w:type="dxa" w:w="50"/>
-              <w:right w:type="dxa" w:w="90"/>
-            </w:tcMar>
-          </w:tcPr>
-          <w:p>
-            <w:pPr>
-              <w:spacing w:after="0" w:line="260"/>
-              <w:jc w:val="left"/>
-            </w:pPr>
-            <w:r>
-              <w:rPr>
-                <w:b w:val="false"/>
-                <w:bCs w:val="false"/>
-                <w:sz w:val="19"/>
-                <w:szCs w:val="19"/>
-              </w:rPr>
-              <w:t xml:space="preserve">the distinct pages a program uses</w:t>
-            </w:r>
-          </w:p>
-        </w:tc>
-      </w:tr>
-      <w:tr>
-        <w:trPr>
-          <w:cantSplit/>
-          <w:tblHeader w:val="off"/>
-        </w:trPr>
-        <w:tc>
-          <w:tcPr>
-            <w:tcW w:type="dxa" w:w="2340"/>
-            <w:tcBorders>
-              <w:top w:val="single" w:color="BFBAB0" w:sz="4"/>
-              <w:left w:val="single" w:color="BFBAB0" w:sz="4"/>
-              <w:bottom w:val="single" w:color="BFBAB0" w:sz="4"/>
-              <w:right w:val="single" w:color="BFBAB0" w:sz="4"/>
-            </w:tcBorders>
-            <w:tcMar>
-              <w:top w:type="dxa" w:w="50"/>
-              <w:left w:type="dxa" w:w="90"/>
-              <w:bottom w:type="dxa" w:w="50"/>
-              <w:right w:type="dxa" w:w="90"/>
-            </w:tcMar>
-          </w:tcPr>
-          <w:p>
-            <w:pPr>
-              <w:spacing w:after="0" w:line="260"/>
-              <w:jc w:val="left"/>
-            </w:pPr>
-            <w:r>
-              <w:rPr>
-                <w:b w:val="false"/>
-                <w:bCs w:val="false"/>
-                <w:sz w:val="19"/>
-                <w:szCs w:val="19"/>
-              </w:rPr>
-              <w:t xml:space="preserve">Eviction policy</w:t>
-            </w:r>
-          </w:p>
-        </w:tc>
-        <w:tc>
-          <w:tcPr>
-            <w:tcW w:type="dxa" w:w="6660"/>
-            <w:tcBorders>
-              <w:top w:val="single" w:color="BFBAB0" w:sz="4"/>
-              <w:left w:val="single" w:color="BFBAB0" w:sz="4"/>
-              <w:bottom w:val="single" w:color="BFBAB0" w:sz="4"/>
-              <w:right w:val="single" w:color="BFBAB0" w:sz="4"/>
-            </w:tcBorders>
-            <w:tcMar>
-              <w:top w:type="dxa" w:w="50"/>
-              <w:left w:type="dxa" w:w="90"/>
-              <w:bottom w:type="dxa" w:w="50"/>
-              <w:right w:type="dxa" w:w="90"/>
-            </w:tcMar>
-          </w:tcPr>
-          <w:p>
-            <w:pPr>
-              <w:spacing w:after="0" w:line="260"/>
-              <w:jc w:val="left"/>
-            </w:pPr>
-            <w:r>
-              <w:rPr>
-                <w:b w:val="false"/>
-                <w:bCs w:val="false"/>
-                <w:sz w:val="19"/>
-                <w:szCs w:val="19"/>
-              </w:rPr>
-              <w:t xml:space="preserve">the rule that chooses which page leaves RAM</w:t>
-            </w:r>
-          </w:p>
-        </w:tc>
-      </w:tr>
-      <w:tr>
-        <w:trPr>
-          <w:cantSplit/>
-          <w:tblHeader w:val="off"/>
-        </w:trPr>
-        <w:tc>
-          <w:tcPr>
-            <w:tcW w:type="dxa" w:w="2340"/>
-            <w:tcBorders>
-              <w:top w:val="single" w:color="BFBAB0" w:sz="4"/>
-              <w:left w:val="single" w:color="BFBAB0" w:sz="4"/>
-              <w:bottom w:val="single" w:color="BFBAB0" w:sz="4"/>
-              <w:right w:val="single" w:color="BFBAB0" w:sz="4"/>
-            </w:tcBorders>
-            <w:tcMar>
-              <w:top w:type="dxa" w:w="50"/>
-              <w:left w:type="dxa" w:w="90"/>
-              <w:bottom w:type="dxa" w:w="50"/>
-              <w:right w:type="dxa" w:w="90"/>
-            </w:tcMar>
-          </w:tcPr>
-          <w:p>
-            <w:pPr>
-              <w:spacing w:after="0" w:line="260"/>
-              <w:jc w:val="left"/>
-            </w:pPr>
-            <w:r>
-              <w:rPr>
-                <w:b w:val="false"/>
-                <w:bCs w:val="false"/>
-                <w:sz w:val="19"/>
-                <w:szCs w:val="19"/>
-              </w:rPr>
-              <w:t xml:space="preserve">OPT</w:t>
-            </w:r>
-          </w:p>
-        </w:tc>
-        <w:tc>
-          <w:tcPr>
-            <w:tcW w:type="dxa" w:w="6660"/>
-            <w:tcBorders>
-              <w:top w:val="single" w:color="BFBAB0" w:sz="4"/>
-              <w:left w:val="single" w:color="BFBAB0" w:sz="4"/>
-              <w:bottom w:val="single" w:color="BFBAB0" w:sz="4"/>
-              <w:right w:val="single" w:color="BFBAB0" w:sz="4"/>
-            </w:tcBorders>
-            <w:tcMar>
-              <w:top w:type="dxa" w:w="50"/>
-              <w:left w:type="dxa" w:w="90"/>
-              <w:bottom w:type="dxa" w:w="50"/>
-              <w:right w:type="dxa" w:w="90"/>
-            </w:tcMar>
-          </w:tcPr>
-          <w:p>
-            <w:pPr>
-              <w:spacing w:after="0" w:line="260"/>
-              <w:jc w:val="left"/>
-            </w:pPr>
-            <w:r>
-              <w:rPr>
-                <w:b w:val="false"/>
-                <w:bCs w:val="false"/>
-                <w:sz w:val="19"/>
-                <w:szCs w:val="19"/>
-              </w:rPr>
-              <w:t xml:space="preserve">Belady’s optimal eviction using knowledge of the future</w:t>
-            </w:r>
-          </w:p>
-        </w:tc>
-      </w:tr>
-      <w:tr>
-        <w:trPr>
-          <w:cantSplit/>
-          <w:tblHeader w:val="off"/>
-        </w:trPr>
-        <w:tc>
-          <w:tcPr>
-            <w:tcW w:type="dxa" w:w="2340"/>
-            <w:tcBorders>
-              <w:top w:val="single" w:color="BFBAB0" w:sz="4"/>
-              <w:left w:val="single" w:color="BFBAB0" w:sz="4"/>
-              <w:bottom w:val="single" w:color="BFBAB0" w:sz="4"/>
-              <w:right w:val="single" w:color="BFBAB0" w:sz="4"/>
-            </w:tcBorders>
-            <w:tcMar>
-              <w:top w:type="dxa" w:w="50"/>
-              <w:left w:type="dxa" w:w="90"/>
-              <w:bottom w:type="dxa" w:w="50"/>
-              <w:right w:type="dxa" w:w="90"/>
-            </w:tcMar>
-          </w:tcPr>
-          <w:p>
-            <w:pPr>
-              <w:spacing w:after="0" w:line="260"/>
-              <w:jc w:val="left"/>
-            </w:pPr>
-            <w:r>
-              <w:rPr>
-                <w:b w:val="false"/>
-                <w:bCs w:val="false"/>
-                <w:sz w:val="19"/>
-                <w:szCs w:val="19"/>
-              </w:rPr>
-              <w:t xml:space="preserve">Prefetching</w:t>
-            </w:r>
-          </w:p>
-        </w:tc>
-        <w:tc>
-          <w:tcPr>
-            <w:tcW w:type="dxa" w:w="6660"/>
-            <w:tcBorders>
-              <w:top w:val="single" w:color="BFBAB0" w:sz="4"/>
-              <w:left w:val="single" w:color="BFBAB0" w:sz="4"/>
-              <w:bottom w:val="single" w:color="BFBAB0" w:sz="4"/>
-              <w:right w:val="single" w:color="BFBAB0" w:sz="4"/>
-            </w:tcBorders>
-            <w:tcMar>
-              <w:top w:type="dxa" w:w="50"/>
-              <w:left w:type="dxa" w:w="90"/>
-              <w:bottom w:type="dxa" w:w="50"/>
-              <w:right w:type="dxa" w:w="90"/>
-            </w:tcMar>
-          </w:tcPr>
-          <w:p>
-            <w:pPr>
-              <w:spacing w:after="0" w:line="260"/>
-              <w:jc w:val="left"/>
-            </w:pPr>
-            <w:r>
-              <w:rPr>
-                <w:b w:val="false"/>
-                <w:bCs w:val="false"/>
-                <w:sz w:val="19"/>
-                <w:szCs w:val="19"/>
-              </w:rPr>
-              <w:t xml:space="preserve">loading a page before it is requested</w:t>
-            </w:r>
-          </w:p>
-        </w:tc>
-      </w:tr>
-      <w:tr>
-        <w:trPr>
-          <w:cantSplit/>
-          <w:tblHeader w:val="off"/>
-        </w:trPr>
-        <w:tc>
-          <w:tcPr>
-            <w:tcW w:type="dxa" w:w="2340"/>
-            <w:tcBorders>
-              <w:top w:val="single" w:color="BFBAB0" w:sz="4"/>
-              <w:left w:val="single" w:color="BFBAB0" w:sz="4"/>
-              <w:bottom w:val="single" w:color="BFBAB0" w:sz="4"/>
-              <w:right w:val="single" w:color="BFBAB0" w:sz="4"/>
-            </w:tcBorders>
-            <w:tcMar>
-              <w:top w:type="dxa" w:w="50"/>
-              <w:left w:type="dxa" w:w="90"/>
-              <w:bottom w:type="dxa" w:w="50"/>
-              <w:right w:type="dxa" w:w="90"/>
-            </w:tcMar>
-          </w:tcPr>
-          <w:p>
-            <w:pPr>
-              <w:spacing w:after="0" w:line="260"/>
-              <w:jc w:val="left"/>
-            </w:pPr>
-            <w:r>
-              <w:rPr>
-                <w:b w:val="false"/>
-                <w:bCs w:val="false"/>
-                <w:sz w:val="19"/>
-                <w:szCs w:val="19"/>
-              </w:rPr>
-              <w:t xml:space="preserve">Readahead</w:t>
-            </w:r>
-          </w:p>
-        </w:tc>
-        <w:tc>
-          <w:tcPr>
-            <w:tcW w:type="dxa" w:w="6660"/>
-            <w:tcBorders>
-              <w:top w:val="single" w:color="BFBAB0" w:sz="4"/>
-              <w:left w:val="single" w:color="BFBAB0" w:sz="4"/>
-              <w:bottom w:val="single" w:color="BFBAB0" w:sz="4"/>
-              <w:right w:val="single" w:color="BFBAB0" w:sz="4"/>
-            </w:tcBorders>
-            <w:tcMar>
-              <w:top w:type="dxa" w:w="50"/>
-              <w:left w:type="dxa" w:w="90"/>
-              <w:bottom w:type="dxa" w:w="50"/>
-              <w:right w:type="dxa" w:w="90"/>
-            </w:tcMar>
-          </w:tcPr>
-          <w:p>
-            <w:pPr>
-              <w:spacing w:after="0" w:line="260"/>
-              <w:jc w:val="left"/>
-            </w:pPr>
-            <w:r>
-              <w:rPr>
-                <w:b w:val="false"/>
-                <w:bCs w:val="false"/>
-                <w:sz w:val="19"/>
-                <w:szCs w:val="19"/>
-              </w:rPr>
-              <w:t xml:space="preserve">fetching the next pages of a sequential run</w:t>
-            </w:r>
-          </w:p>
-        </w:tc>
-      </w:tr>
-      <w:tr>
-        <w:trPr>
-          <w:cantSplit/>
-          <w:tblHeader w:val="off"/>
-        </w:trPr>
-        <w:tc>
-          <w:tcPr>
-            <w:tcW w:type="dxa" w:w="2340"/>
-            <w:tcBorders>
-              <w:top w:val="single" w:color="BFBAB0" w:sz="4"/>
-              <w:left w:val="single" w:color="BFBAB0" w:sz="4"/>
-              <w:bottom w:val="single" w:color="BFBAB0" w:sz="4"/>
-              <w:right w:val="single" w:color="BFBAB0" w:sz="4"/>
-            </w:tcBorders>
-            <w:tcMar>
-              <w:top w:type="dxa" w:w="50"/>
-              <w:left w:type="dxa" w:w="90"/>
-              <w:bottom w:type="dxa" w:w="50"/>
-              <w:right w:type="dxa" w:w="90"/>
-            </w:tcMar>
-          </w:tcPr>
-          <w:p>
-            <w:pPr>
-              <w:spacing w:after="0" w:line="260"/>
-              <w:jc w:val="left"/>
-            </w:pPr>
-            <w:r>
-              <w:rPr>
-                <w:b w:val="false"/>
-                <w:bCs w:val="false"/>
-                <w:sz w:val="19"/>
-                <w:szCs w:val="19"/>
-              </w:rPr>
-              <w:t xml:space="preserve">Markov predictor</w:t>
-            </w:r>
-          </w:p>
-        </w:tc>
-        <w:tc>
-          <w:tcPr>
-            <w:tcW w:type="dxa" w:w="6660"/>
-            <w:tcBorders>
-              <w:top w:val="single" w:color="BFBAB0" w:sz="4"/>
-              <w:left w:val="single" w:color="BFBAB0" w:sz="4"/>
-              <w:bottom w:val="single" w:color="BFBAB0" w:sz="4"/>
-              <w:right w:val="single" w:color="BFBAB0" w:sz="4"/>
-            </w:tcBorders>
-            <w:tcMar>
-              <w:top w:type="dxa" w:w="50"/>
-              <w:left w:type="dxa" w:w="90"/>
-              <w:bottom w:type="dxa" w:w="50"/>
-              <w:right w:type="dxa" w:w="90"/>
-            </w:tcMar>
-          </w:tcPr>
-          <w:p>
-            <w:pPr>
-              <w:spacing w:after="0" w:line="260"/>
-              <w:jc w:val="left"/>
-            </w:pPr>
-            <w:r>
-              <w:rPr>
-                <w:b w:val="false"/>
-                <w:bCs w:val="false"/>
-                <w:sz w:val="19"/>
-                <w:szCs w:val="19"/>
-              </w:rPr>
-              <w:t xml:space="preserve">a table of observed “next page after this context” counts</w:t>
-            </w:r>
-          </w:p>
-        </w:tc>
-      </w:tr>
-      <w:tr>
-        <w:trPr>
-          <w:cantSplit/>
-          <w:tblHeader w:val="off"/>
-        </w:trPr>
-        <w:tc>
-          <w:tcPr>
-            <w:tcW w:type="dxa" w:w="2340"/>
-            <w:tcBorders>
-              <w:top w:val="single" w:color="BFBAB0" w:sz="4"/>
-              <w:left w:val="single" w:color="BFBAB0" w:sz="4"/>
-              <w:bottom w:val="single" w:color="BFBAB0" w:sz="4"/>
-              <w:right w:val="single" w:color="BFBAB0" w:sz="4"/>
-            </w:tcBorders>
-            <w:tcMar>
-              <w:top w:type="dxa" w:w="50"/>
-              <w:left w:type="dxa" w:w="90"/>
-              <w:bottom w:type="dxa" w:w="50"/>
-              <w:right w:type="dxa" w:w="90"/>
-            </w:tcMar>
-          </w:tcPr>
-          <w:p>
-            <w:pPr>
-              <w:spacing w:after="0" w:line="260"/>
-              <w:jc w:val="left"/>
-            </w:pPr>
-            <w:r>
-              <w:rPr>
-                <w:b w:val="false"/>
-                <w:bCs w:val="false"/>
-                <w:sz w:val="19"/>
-                <w:szCs w:val="19"/>
-              </w:rPr>
-              <w:t xml:space="preserve">Delta-Markov</w:t>
-            </w:r>
-          </w:p>
-        </w:tc>
-        <w:tc>
-          <w:tcPr>
-            <w:tcW w:type="dxa" w:w="6660"/>
-            <w:tcBorders>
-              <w:top w:val="single" w:color="BFBAB0" w:sz="4"/>
-              <w:left w:val="single" w:color="BFBAB0" w:sz="4"/>
-              <w:bottom w:val="single" w:color="BFBAB0" w:sz="4"/>
-              <w:right w:val="single" w:color="BFBAB0" w:sz="4"/>
-            </w:tcBorders>
-            <w:tcMar>
-              <w:top w:type="dxa" w:w="50"/>
-              <w:left w:type="dxa" w:w="90"/>
-              <w:bottom w:type="dxa" w:w="50"/>
-              <w:right w:type="dxa" w:w="90"/>
-            </w:tcMar>
-          </w:tcPr>
-          <w:p>
-            <w:pPr>
-              <w:spacing w:after="0" w:line="260"/>
-              <w:jc w:val="left"/>
-            </w:pPr>
-            <w:r>
-              <w:rPr>
-                <w:b w:val="false"/>
-                <w:bCs w:val="false"/>
-                <w:sz w:val="19"/>
-                <w:szCs w:val="19"/>
-              </w:rPr>
-              <w:t xml:space="preserve">a Markov table over gaps between pages</w:t>
-            </w:r>
-          </w:p>
-        </w:tc>
-      </w:tr>
-      <w:tr>
-        <w:trPr>
-          <w:cantSplit/>
-          <w:tblHeader w:val="off"/>
-        </w:trPr>
-        <w:tc>
-          <w:tcPr>
-            <w:tcW w:type="dxa" w:w="2340"/>
-            <w:tcBorders>
-              <w:top w:val="single" w:color="BFBAB0" w:sz="4"/>
-              <w:left w:val="single" w:color="BFBAB0" w:sz="4"/>
-              <w:bottom w:val="single" w:color="BFBAB0" w:sz="4"/>
-              <w:right w:val="single" w:color="BFBAB0" w:sz="4"/>
-            </w:tcBorders>
-            <w:tcMar>
-              <w:top w:type="dxa" w:w="50"/>
-              <w:left w:type="dxa" w:w="90"/>
-              <w:bottom w:type="dxa" w:w="50"/>
-              <w:right w:type="dxa" w:w="90"/>
-            </w:tcMar>
-          </w:tcPr>
-          <w:p>
-            <w:pPr>
-              <w:spacing w:after="0" w:line="260"/>
-              <w:jc w:val="left"/>
-            </w:pPr>
-            <w:r>
-              <w:rPr>
-                <w:b w:val="false"/>
-                <w:bCs w:val="false"/>
-                <w:sz w:val="19"/>
-                <w:szCs w:val="19"/>
-              </w:rPr>
-              <w:t xml:space="preserve">Fault delta</w:t>
-            </w:r>
-          </w:p>
-        </w:tc>
-        <w:tc>
-          <w:tcPr>
-            <w:tcW w:type="dxa" w:w="6660"/>
-            <w:tcBorders>
-              <w:top w:val="single" w:color="BFBAB0" w:sz="4"/>
-              <w:left w:val="single" w:color="BFBAB0" w:sz="4"/>
-              <w:bottom w:val="single" w:color="BFBAB0" w:sz="4"/>
-              <w:right w:val="single" w:color="BFBAB0" w:sz="4"/>
-            </w:tcBorders>
-            <w:tcMar>
-              <w:top w:type="dxa" w:w="50"/>
-              <w:left w:type="dxa" w:w="90"/>
-              <w:bottom w:type="dxa" w:w="50"/>
-              <w:right w:type="dxa" w:w="90"/>
-            </w:tcMar>
-          </w:tcPr>
-          <w:p>
-            <w:pPr>
-              <w:spacing w:after="0" w:line="260"/>
-              <w:jc w:val="left"/>
-            </w:pPr>
-            <w:r>
-              <w:rPr>
-                <w:b w:val="false"/>
-                <w:bCs w:val="false"/>
-                <w:sz w:val="19"/>
-                <w:szCs w:val="19"/>
-              </w:rPr>
-              <w:t xml:space="preserve">faults without prefetching minus faults with prefetching</w:t>
-            </w:r>
-          </w:p>
-        </w:tc>
-      </w:tr>
-      <w:tr>
-        <w:trPr>
-          <w:cantSplit/>
-          <w:tblHeader w:val="off"/>
-        </w:trPr>
-        <w:tc>
-          <w:tcPr>
-            <w:tcW w:type="dxa" w:w="2340"/>
-            <w:tcBorders>
-              <w:top w:val="single" w:color="BFBAB0" w:sz="4"/>
-              <w:left w:val="single" w:color="BFBAB0" w:sz="4"/>
-              <w:bottom w:val="single" w:color="BFBAB0" w:sz="4"/>
-              <w:right w:val="single" w:color="BFBAB0" w:sz="4"/>
-            </w:tcBorders>
-            <w:tcMar>
-              <w:top w:type="dxa" w:w="50"/>
-              <w:left w:type="dxa" w:w="90"/>
-              <w:bottom w:type="dxa" w:w="50"/>
-              <w:right w:type="dxa" w:w="90"/>
-            </w:tcMar>
-          </w:tcPr>
-          <w:p>
-            <w:pPr>
-              <w:spacing w:after="0" w:line="260"/>
-              <w:jc w:val="left"/>
-            </w:pPr>
-            <w:r>
-              <w:rPr>
-                <w:b w:val="false"/>
-                <w:bCs w:val="false"/>
-                <w:sz w:val="19"/>
-                <w:szCs w:val="19"/>
-              </w:rPr>
-              <w:t xml:space="preserve">Shadow directory</w:t>
-            </w:r>
-          </w:p>
-        </w:tc>
-        <w:tc>
-          <w:tcPr>
-            <w:tcW w:type="dxa" w:w="6660"/>
-            <w:tcBorders>
-              <w:top w:val="single" w:color="BFBAB0" w:sz="4"/>
-              <w:left w:val="single" w:color="BFBAB0" w:sz="4"/>
-              <w:bottom w:val="single" w:color="BFBAB0" w:sz="4"/>
-              <w:right w:val="single" w:color="BFBAB0" w:sz="4"/>
-            </w:tcBorders>
-            <w:tcMar>
-              <w:top w:type="dxa" w:w="50"/>
-              <w:left w:type="dxa" w:w="90"/>
-              <w:bottom w:type="dxa" w:w="50"/>
-              <w:right w:type="dxa" w:w="90"/>
-            </w:tcMar>
-          </w:tcPr>
-          <w:p>
-            <w:pPr>
-              <w:spacing w:after="0" w:line="260"/>
-              <w:jc w:val="left"/>
-            </w:pPr>
-            <w:r>
-              <w:rPr>
-                <w:b w:val="false"/>
-                <w:bCs w:val="false"/>
-                <w:sz w:val="19"/>
-                <w:szCs w:val="19"/>
-              </w:rPr>
-              <w:t xml:space="preserve">a no-prefetch copy of the eviction policy holding page identifiers only</w:t>
-            </w:r>
-          </w:p>
-        </w:tc>
-      </w:tr>
-      <w:tr>
-        <w:trPr>
-          <w:cantSplit/>
-          <w:tblHeader w:val="off"/>
-        </w:trPr>
-        <w:tc>
-          <w:tcPr>
-            <w:tcW w:type="dxa" w:w="2340"/>
-            <w:tcBorders>
-              <w:top w:val="single" w:color="BFBAB0" w:sz="4"/>
-              <w:left w:val="single" w:color="BFBAB0" w:sz="4"/>
-              <w:bottom w:val="single" w:color="BFBAB0" w:sz="4"/>
-              <w:right w:val="single" w:color="BFBAB0" w:sz="4"/>
-            </w:tcBorders>
-            <w:tcMar>
-              <w:top w:type="dxa" w:w="50"/>
-              <w:left w:type="dxa" w:w="90"/>
-              <w:bottom w:type="dxa" w:w="50"/>
-              <w:right w:type="dxa" w:w="90"/>
-            </w:tcMar>
-          </w:tcPr>
-          <w:p>
-            <w:pPr>
-              <w:spacing w:after="0" w:line="260"/>
-              <w:jc w:val="left"/>
-            </w:pPr>
-            <w:r>
-              <w:rPr>
-                <w:b w:val="false"/>
-                <w:bCs w:val="false"/>
-                <w:sz w:val="19"/>
-                <w:szCs w:val="19"/>
-              </w:rPr>
-              <w:t xml:space="preserve">Warm-up portion</w:t>
-            </w:r>
-          </w:p>
-        </w:tc>
-        <w:tc>
-          <w:tcPr>
-            <w:tcW w:type="dxa" w:w="6660"/>
-            <w:tcBorders>
-              <w:top w:val="single" w:color="BFBAB0" w:sz="4"/>
-              <w:left w:val="single" w:color="BFBAB0" w:sz="4"/>
-              <w:bottom w:val="single" w:color="BFBAB0" w:sz="4"/>
-              <w:right w:val="single" w:color="BFBAB0" w:sz="4"/>
-            </w:tcBorders>
-            <w:tcMar>
-              <w:top w:type="dxa" w:w="50"/>
-              <w:left w:type="dxa" w:w="90"/>
-              <w:bottom w:type="dxa" w:w="50"/>
-              <w:right w:type="dxa" w:w="90"/>
-            </w:tcMar>
-          </w:tcPr>
-          <w:p>
-            <w:pPr>
-              <w:spacing w:after="0" w:line="260"/>
-              <w:jc w:val="left"/>
-            </w:pPr>
-            <w:r>
-              <w:rPr>
-                <w:b w:val="false"/>
-                <w:bCs w:val="false"/>
-                <w:sz w:val="19"/>
-                <w:szCs w:val="19"/>
-              </w:rPr>
-              <w:t xml:space="preserve">the first 25% of each trace, the only data used to choose settings</w:t>
-            </w:r>
-          </w:p>
-        </w:tc>
-      </w:tr>
-      <w:tr>
-        <w:trPr>
-          <w:cantSplit/>
-          <w:tblHeader w:val="off"/>
-        </w:trPr>
-        <w:tc>
-          <w:tcPr>
-            <w:tcW w:type="dxa" w:w="2340"/>
-            <w:tcBorders>
-              <w:top w:val="single" w:color="BFBAB0" w:sz="4"/>
-              <w:left w:val="single" w:color="BFBAB0" w:sz="4"/>
-              <w:bottom w:val="single" w:color="BFBAB0" w:sz="4"/>
-              <w:right w:val="single" w:color="BFBAB0" w:sz="4"/>
-            </w:tcBorders>
-            <w:tcMar>
-              <w:top w:type="dxa" w:w="50"/>
-              <w:left w:type="dxa" w:w="90"/>
-              <w:bottom w:type="dxa" w:w="50"/>
-              <w:right w:type="dxa" w:w="90"/>
-            </w:tcMar>
-          </w:tcPr>
-          <w:p>
-            <w:pPr>
-              <w:spacing w:after="0" w:line="260"/>
-              <w:jc w:val="left"/>
-            </w:pPr>
-            <w:r>
-              <w:rPr>
-                <w:b w:val="false"/>
-                <w:bCs w:val="false"/>
-                <w:sz w:val="19"/>
-                <w:szCs w:val="19"/>
-              </w:rPr>
-              <w:t xml:space="preserve">vs_LRU</w:t>
-            </w:r>
-          </w:p>
-        </w:tc>
-        <w:tc>
-          <w:tcPr>
-            <w:tcW w:type="dxa" w:w="6660"/>
-            <w:tcBorders>
-              <w:top w:val="single" w:color="BFBAB0" w:sz="4"/>
-              <w:left w:val="single" w:color="BFBAB0" w:sz="4"/>
-              <w:bottom w:val="single" w:color="BFBAB0" w:sz="4"/>
-              <w:right w:val="single" w:color="BFBAB0" w:sz="4"/>
-            </w:tcBorders>
-            <w:tcMar>
-              <w:top w:type="dxa" w:w="50"/>
-              <w:left w:type="dxa" w:w="90"/>
-              <w:bottom w:type="dxa" w:w="50"/>
-              <w:right w:type="dxa" w:w="90"/>
-            </w:tcMar>
-          </w:tcPr>
-          <w:p>
-            <w:pPr>
-              <w:spacing w:after="0" w:line="260"/>
-              <w:jc w:val="left"/>
-            </w:pPr>
-            <w:r>
-              <w:rPr>
-                <w:b w:val="false"/>
-                <w:bCs w:val="false"/>
-                <w:sz w:val="19"/>
-                <w:szCs w:val="19"/>
-              </w:rPr>
-              <w:t xml:space="preserve">fraction of LRU’s faults removed; positive is better</w:t>
-            </w:r>
-          </w:p>
-        </w:tc>
-      </w:tr>
-      <w:tr>
-        <w:trPr>
-          <w:cantSplit/>
-          <w:tblHeader w:val="off"/>
-        </w:trPr>
-        <w:tc>
-          <w:tcPr>
-            <w:tcW w:type="dxa" w:w="2340"/>
-            <w:tcBorders>
-              <w:top w:val="single" w:color="BFBAB0" w:sz="4"/>
-              <w:left w:val="single" w:color="BFBAB0" w:sz="4"/>
-              <w:bottom w:val="single" w:color="BFBAB0" w:sz="4"/>
-              <w:right w:val="single" w:color="BFBAB0" w:sz="4"/>
-            </w:tcBorders>
-            <w:tcMar>
-              <w:top w:type="dxa" w:w="50"/>
-              <w:left w:type="dxa" w:w="90"/>
-              <w:bottom w:type="dxa" w:w="50"/>
-              <w:right w:type="dxa" w:w="90"/>
-            </w:tcMar>
-          </w:tcPr>
-          <w:p>
-            <w:pPr>
-              <w:spacing w:after="0" w:line="260"/>
-              <w:jc w:val="left"/>
-            </w:pPr>
-            <w:r>
-              <w:rPr>
-                <w:b w:val="false"/>
-                <w:bCs w:val="false"/>
-                <w:sz w:val="19"/>
-                <w:szCs w:val="19"/>
-              </w:rPr>
-              <w:t xml:space="preserve">Speed-up</w:t>
-            </w:r>
-          </w:p>
-        </w:tc>
-        <w:tc>
-          <w:tcPr>
-            <w:tcW w:type="dxa" w:w="6660"/>
-            <w:tcBorders>
-              <w:top w:val="single" w:color="BFBAB0" w:sz="4"/>
-              <w:left w:val="single" w:color="BFBAB0" w:sz="4"/>
-              <w:bottom w:val="single" w:color="BFBAB0" w:sz="4"/>
-              <w:right w:val="single" w:color="BFBAB0" w:sz="4"/>
-            </w:tcBorders>
-            <w:tcMar>
-              <w:top w:type="dxa" w:w="50"/>
-              <w:left w:type="dxa" w:w="90"/>
-              <w:bottom w:type="dxa" w:w="50"/>
-              <w:right w:type="dxa" w:w="90"/>
-            </w:tcMar>
-          </w:tcPr>
-          <w:p>
-            <w:pPr>
-              <w:spacing w:after="0" w:line="260"/>
-              <w:jc w:val="left"/>
-            </w:pPr>
-            <w:r>
-              <w:rPr>
-                <w:b w:val="false"/>
-                <w:bCs w:val="false"/>
-                <w:sz w:val="19"/>
-                <w:szCs w:val="19"/>
-              </w:rPr>
-              <w:t xml:space="preserve">estimated time of LRU divided by the time of a system</w:t>
-            </w:r>
-          </w:p>
-        </w:tc>
-      </w:tr>
-    </w:tbl>
-    <w:p>
-      <w:pPr>
-        <w:spacing w:after="160"/>
-      </w:pPr>
-    </w:p>
     <w:sectPr>
       <w:headerReference w:type="default" r:id="rId6"/>
       <w:footerReference w:type="default" r:id="rId7"/>
@@ -29128,12 +27843,6 @@
   </w:num>
   <w:num w:numId="5">
     <w:abstractNumId w:val="4"/>
-    <w:lvlOverride w:ilvl="0">
-      <w:startOverride w:val="1"/>
-    </w:lvlOverride>
-  </w:num>
-  <w:num w:numId="6">
-    <w:abstractNumId w:val="5"/>
     <w:lvlOverride w:ilvl="0">
       <w:startOverride w:val="1"/>
     </w:lvlOverride>

</xml_diff>